<commit_message>
docs: update PR check evidences
</commit_message>
<xml_diff>
--- a/Analise/RELATORIO-PIPELINE-CI-SONARQUBE.docx
+++ b/Analise/RELATORIO-PIPELINE-CI-SONARQUBE.docx
@@ -31,7 +31,7 @@
     <w:p/>
     <w:p>
       <w:r>
-        <w:t>Status geral: VERDE - estrutura, aplicacao, testes, workflow e configuracao SonarQube preparados; testes locais passaram com 100% de cobertura.</w:t>
+        <w:t>Status geral: VERDE - estrutura, aplicacao, testes, workflow e configuracao SonarQube preparados; testes locais passaram com 100% de cobertura e checks do PR passaram no GitHub Actions/SonarCloud.</w:t>
       </w:r>
     </w:p>
     <w:p/>
@@ -162,7 +162,12 @@
     </w:p>
     <w:p>
       <w:r>
-        <w:t>| Branch Protection | Instrucoes no README | PENDENTE - configurar no GitHub apos publicar o repositorio |</w:t>
+        <w:t>| Pull Request aberto | `https://github.com/fredjml/fc-pipeline-CI-sonarqube/pull/1` | VERDE - OK |</w:t>
+      </w:r>
+    </w:p>
+    <w:p>
+      <w:r>
+        <w:t>| Branch Protection | Instrucoes no README | PENDENTE - marcar checks como Required no GitHub |</w:t>
       </w:r>
     </w:p>
     <w:p/>
@@ -533,7 +538,61 @@
     <w:p/>
     <w:p>
       <w:r>
-        <w:t>O entregavel final deve ser o link do Pull Request aberto, com os checks `tests` e `sonarqube` verdes e marcados como `Required`.</w:t>
+        <w:t>Pull Request aberto:</w:t>
+      </w:r>
+    </w:p>
+    <w:p/>
+    <w:p>
+      <w:r>
+        <w:t>```text</w:t>
+      </w:r>
+    </w:p>
+    <w:p>
+      <w:r>
+        <w:t>https://github.com/fredjml/fc-pipeline-CI-sonarqube/pull/1</w:t>
+      </w:r>
+    </w:p>
+    <w:p>
+      <w:r>
+        <w:t>```</w:t>
+      </w:r>
+    </w:p>
+    <w:p/>
+    <w:p>
+      <w:r>
+        <w:t>Checks validados no PR:</w:t>
+      </w:r>
+    </w:p>
+    <w:p/>
+    <w:p>
+      <w:r>
+        <w:t>| Check | Resultado |</w:t>
+      </w:r>
+    </w:p>
+    <w:p>
+      <w:r>
+        <w:t>| --- | --- |</w:t>
+      </w:r>
+    </w:p>
+    <w:p>
+      <w:r>
+        <w:t>| `tests` | Verde - passou |</w:t>
+      </w:r>
+    </w:p>
+    <w:p>
+      <w:r>
+        <w:t>| `sonarqube` | Verde - passou |</w:t>
+      </w:r>
+    </w:p>
+    <w:p>
+      <w:r>
+        <w:t>| `SonarCloud Code Analysis` | Verde - passou |</w:t>
+      </w:r>
+    </w:p>
+    <w:p/>
+    <w:p>
+      <w:r>
+        <w:t>O entregavel final deve manter o Pull Request aberto, com os checks `tests`, `sonarqube` e/ou `SonarCloud Code Analysis` verdes e marcados como `Required`.</w:t>
       </w:r>
     </w:p>
     <w:p/>

</xml_diff>

<commit_message>
docs: record required status checks evidence
</commit_message>
<xml_diff>
--- a/Analise/RELATORIO-PIPELINE-CI-SONARQUBE.docx
+++ b/Analise/RELATORIO-PIPELINE-CI-SONARQUBE.docx
@@ -167,7 +167,7 @@
     </w:p>
     <w:p>
       <w:r>
-        <w:t>| Branch Protection | Instrucoes no README | PENDENTE - marcar checks como Required no GitHub |</w:t>
+        <w:t>| Branch Protection | Checks `tests`, `sonarqube` e `SonarCloud Code Analysis` configurados como obrigatorios | VERDE - OK |</w:t>
       </w:r>
     </w:p>
     <w:p/>
@@ -592,7 +592,39 @@
     <w:p/>
     <w:p>
       <w:r>
-        <w:t>O entregavel final deve manter o Pull Request aberto, com os checks `tests`, `sonarqube` e/ou `SonarCloud Code Analysis` verdes e marcados como `Required`.</w:t>
+        <w:t>Required status checks configurados na branch `main`:</w:t>
+      </w:r>
+    </w:p>
+    <w:p/>
+    <w:p>
+      <w:r>
+        <w:t>| Required check | Origem |</w:t>
+      </w:r>
+    </w:p>
+    <w:p>
+      <w:r>
+        <w:t>| --- | --- |</w:t>
+      </w:r>
+    </w:p>
+    <w:p>
+      <w:r>
+        <w:t>| `tests` | GitHub Actions |</w:t>
+      </w:r>
+    </w:p>
+    <w:p>
+      <w:r>
+        <w:t>| `sonarqube` | GitHub Actions |</w:t>
+      </w:r>
+    </w:p>
+    <w:p>
+      <w:r>
+        <w:t>| `SonarCloud Code Analysis` | SonarCloud |</w:t>
+      </w:r>
+    </w:p>
+    <w:p/>
+    <w:p>
+      <w:r>
+        <w:t>O entregavel final deve manter o Pull Request aberto, com os checks `tests`, `sonarqube` e `SonarCloud Code Analysis` verdes e marcados como `Required`.</w:t>
       </w:r>
     </w:p>
     <w:p/>

</xml_diff>